<commit_message>
Polish user guide layout
</commit_message>
<xml_diff>
--- a/CST8411-Math-Toolkit-User-Guide.docx
+++ b/CST8411-Math-Toolkit-User-Guide.docx
@@ -463,6 +463,7 @@
     </w:p>
     <w:p>
       <w:pPr>
+        <w:keepLines/>
         <w:spacing w:before="80" w:after="160" w:line="240" w:lineRule="auto"/>
         <w:ind w:left="259" w:right="259"/>
         <w:shd w:fill="F4F6F9"/>
@@ -495,6 +496,10 @@
     <w:p>
       <w:pPr>
         <w:pStyle w:val="ListNumber"/>
+        <w:numPr>
+          <w:ilvl w:val="0"/>
+          <w:numId w:val="10"/>
+        </w:numPr>
       </w:pPr>
       <w:r>
         <w:t>Create a lib directory in the consuming Java project.</w:t>
@@ -503,6 +508,10 @@
     <w:p>
       <w:pPr>
         <w:pStyle w:val="ListNumber"/>
+        <w:numPr>
+          <w:ilvl w:val="0"/>
+          <w:numId w:val="10"/>
+        </w:numPr>
       </w:pPr>
       <w:r>
         <w:t>Copy math-toolkit-1.0.0.jar into the lib directory.</w:t>
@@ -511,6 +520,10 @@
     <w:p>
       <w:pPr>
         <w:pStyle w:val="ListNumber"/>
+        <w:numPr>
+          <w:ilvl w:val="0"/>
+          <w:numId w:val="10"/>
+        </w:numPr>
       </w:pPr>
       <w:r>
         <w:t>Add the JAR to the compile and runtime classpath.</w:t>
@@ -518,6 +531,7 @@
     </w:p>
     <w:p>
       <w:pPr>
+        <w:keepLines/>
         <w:spacing w:before="80" w:after="160" w:line="240" w:lineRule="auto"/>
         <w:ind w:left="259" w:right="259"/>
         <w:shd w:fill="F4F6F9"/>
@@ -548,6 +562,7 @@
     </w:p>
     <w:p>
       <w:pPr>
+        <w:keepLines/>
         <w:spacing w:before="80" w:after="160" w:line="240" w:lineRule="auto"/>
         <w:ind w:left="259" w:right="259"/>
         <w:shd w:fill="F4F6F9"/>
@@ -573,6 +588,7 @@
     </w:p>
     <w:p>
       <w:pPr>
+        <w:keepLines/>
         <w:spacing w:before="80" w:after="160" w:line="240" w:lineRule="auto"/>
         <w:ind w:left="259" w:right="259"/>
         <w:shd w:fill="F4F6F9"/>
@@ -609,6 +625,7 @@
     </w:p>
     <w:p>
       <w:pPr>
+        <w:keepLines/>
         <w:spacing w:before="80" w:after="160" w:line="240" w:lineRule="auto"/>
         <w:ind w:left="259" w:right="259"/>
         <w:shd w:fill="F4F6F9"/>
@@ -654,6 +671,7 @@
     </w:p>
     <w:p>
       <w:pPr>
+        <w:keepLines/>
         <w:spacing w:before="80" w:after="160" w:line="240" w:lineRule="auto"/>
         <w:ind w:left="259" w:right="259"/>
         <w:shd w:fill="F4F6F9"/>
@@ -689,6 +707,7 @@
     </w:p>
     <w:p>
       <w:pPr>
+        <w:keepLines/>
         <w:spacing w:before="80" w:after="160" w:line="240" w:lineRule="auto"/>
         <w:ind w:left="259" w:right="259"/>
         <w:shd w:fill="F4F6F9"/>
@@ -713,6 +732,7 @@
     </w:p>
     <w:p>
       <w:pPr>
+        <w:keepLines/>
         <w:spacing w:before="80" w:after="160" w:line="240" w:lineRule="auto"/>
         <w:ind w:left="259" w:right="259"/>
         <w:shd w:fill="F4F6F9"/>
@@ -1287,6 +1307,7 @@
     </w:p>
     <w:p>
       <w:pPr>
+        <w:keepLines/>
         <w:spacing w:before="80" w:after="160" w:line="240" w:lineRule="auto"/>
         <w:ind w:left="259" w:right="259"/>
         <w:shd w:fill="F4F6F9"/>
@@ -1319,6 +1340,10 @@
     <w:p>
       <w:pPr>
         <w:pStyle w:val="ListNumber"/>
+        <w:numPr>
+          <w:ilvl w:val="0"/>
+          <w:numId w:val="11"/>
+        </w:numPr>
       </w:pPr>
       <w:r>
         <w:t>Clone or download the repository.</w:t>
@@ -1327,6 +1352,10 @@
     <w:p>
       <w:pPr>
         <w:pStyle w:val="ListNumber"/>
+        <w:numPr>
+          <w:ilvl w:val="0"/>
+          <w:numId w:val="11"/>
+        </w:numPr>
       </w:pPr>
       <w:r>
         <w:t>Open PowerShell in the project root.</w:t>
@@ -1335,6 +1364,10 @@
     <w:p>
       <w:pPr>
         <w:pStyle w:val="ListNumber"/>
+        <w:numPr>
+          <w:ilvl w:val="0"/>
+          <w:numId w:val="11"/>
+        </w:numPr>
       </w:pPr>
       <w:r>
         <w:t>Run .\build.ps1.</w:t>
@@ -1343,6 +1376,10 @@
     <w:p>
       <w:pPr>
         <w:pStyle w:val="ListNumber"/>
+        <w:numPr>
+          <w:ilvl w:val="0"/>
+          <w:numId w:val="11"/>
+        </w:numPr>
       </w:pPr>
       <w:r>
         <w:t>Confirm that all 12 checks pass and the dist directory is created.</w:t>
@@ -1350,6 +1387,7 @@
     </w:p>
     <w:p>
       <w:pPr>
+        <w:keepLines/>
         <w:spacing w:before="80" w:after="160" w:line="240" w:lineRule="auto"/>
         <w:ind w:left="259" w:right="259"/>
         <w:shd w:fill="F4F6F9"/>
@@ -1371,6 +1409,7 @@
     <w:p>
       <w:pPr>
         <w:pStyle w:val="Heading1"/>
+        <w:pageBreakBefore/>
       </w:pPr>
       <w:r>
         <w:t>10. Versioning and Maintenance</w:t>
@@ -1408,6 +1447,7 @@
     <w:p>
       <w:pPr>
         <w:pStyle w:val="Heading1"/>
+        <w:spacing w:before="160" w:after="100"/>
       </w:pPr>
       <w:r>
         <w:t>11. Submission Checklist</w:t>
@@ -1416,6 +1456,7 @@
     <w:p>
       <w:pPr>
         <w:pStyle w:val="ListBullet"/>
+        <w:spacing w:after="20" w:line="240" w:lineRule="auto"/>
       </w:pPr>
       <w:r>
         <w:t>Deployable executable JAR is present in dist.</w:t>
@@ -1424,6 +1465,7 @@
     <w:p>
       <w:pPr>
         <w:pStyle w:val="ListBullet"/>
+        <w:spacing w:after="20" w:line="240" w:lineRule="auto"/>
       </w:pPr>
       <w:r>
         <w:t>Manifest contains the Main-Class entry.</w:t>
@@ -1432,6 +1474,7 @@
     <w:p>
       <w:pPr>
         <w:pStyle w:val="ListBullet"/>
+        <w:spacing w:after="20" w:line="240" w:lineRule="auto"/>
       </w:pPr>
       <w:r>
         <w:t>All 12 functional checks pass.</w:t>
@@ -1440,6 +1483,7 @@
     <w:p>
       <w:pPr>
         <w:pStyle w:val="ListBullet"/>
+        <w:spacing w:after="20" w:line="240" w:lineRule="auto"/>
       </w:pPr>
       <w:r>
         <w:t>Source and usage documentation are included.</w:t>
@@ -1448,6 +1492,7 @@
     <w:p>
       <w:pPr>
         <w:pStyle w:val="ListBullet"/>
+        <w:spacing w:after="20" w:line="240" w:lineRule="auto"/>
       </w:pPr>
       <w:r>
         <w:t>Repository and version 1.0.0 release links are accessible.</w:t>
@@ -1703,6 +1748,18 @@
   </w:num>
   <w:num w:numId="9">
     <w:abstractNumId w:val="0"/>
+  </w:num>
+  <w:num w:numId="10">
+    <w:abstractNumId w:val="7"/>
+    <w:lvlOverride w:ilvl="0">
+      <w:startOverride w:val="1"/>
+    </w:lvlOverride>
+  </w:num>
+  <w:num w:numId="11">
+    <w:abstractNumId w:val="7"/>
+    <w:lvlOverride w:ilvl="0">
+      <w:startOverride w:val="1"/>
+    </w:lvlOverride>
   </w:num>
 </w:numbering>
 </file>

</xml_diff>